<commit_message>
Update data availability statement with open dataset URL
Data source: github.com/longshike/LNN-for-SAP-Prediction (Apache-2.0)

Co-Authored-By: Claude Haiku 4.5 <noreply@anthropic.com>
Claude-Session: https://claude.ai/code/session_01CuGuRE9DA8sYLY8ts7uK3D
</commit_message>
<xml_diff>
--- a/outreach/sap_manuscript.docx
+++ b/outreach/sap_manuscript.docx
@@ -4113,7 +4113,7 @@
       </w:r>
     </w:p>
     <w:bookmarkEnd w:id="45"/>
-    <w:bookmarkStart w:id="46" w:name="data-availability"/>
+    <w:bookmarkStart w:id="47" w:name="data-availability"/>
     <w:p>
       <w:pPr>
         <w:pStyle w:val="Heading1"/>
@@ -4127,7 +4127,24 @@
         <w:pStyle w:val="FirstParagraph"/>
       </w:pPr>
       <w:r>
-        <w:t xml:space="preserve">The de-identified dataset is not publicly distributed due to patient privacy constraints. The full analysis pipeline, model architectures, and preprocessing code are available at</w:t>
+        <w:t xml:space="preserve">The study used only openly available human data that were originally located at:</w:t>
+      </w:r>
+      <w:r>
+        <w:t xml:space="preserve"> </w:t>
+      </w:r>
+      <w:hyperlink r:id="rId46">
+        <w:r>
+          <w:rPr>
+            <w:rStyle w:val="Hyperlink"/>
+          </w:rPr>
+          <w:t xml:space="preserve">https://github.com/longshike/LNN-for-SAP-Prediction</w:t>
+        </w:r>
+      </w:hyperlink>
+      <w:r>
+        <w:t xml:space="preserve"> </w:t>
+      </w:r>
+      <w:r>
+        <w:t xml:space="preserve">(Apache-2.0 licence; 722 patients, de-identified, identifier columns removed prior to analysis). The full analysis pipeline, model architectures, and preprocessing code are available at</w:t>
       </w:r>
       <w:r>
         <w:t xml:space="preserve"> </w:t>
@@ -4144,8 +4161,8 @@
         <w:t xml:space="preserve">.</w:t>
       </w:r>
     </w:p>
-    <w:bookmarkEnd w:id="46"/>
-    <w:bookmarkStart w:id="47" w:name="code-availability"/>
+    <w:bookmarkEnd w:id="47"/>
+    <w:bookmarkStart w:id="48" w:name="code-availability"/>
     <w:p>
       <w:pPr>
         <w:pStyle w:val="Heading1"/>
@@ -4176,8 +4193,8 @@
         <w:t xml:space="preserve">. Requires Python 3.10, scikit-learn 1.3, TensorFlow 2.13, and standard scientific Python libraries (NumPy, pandas, Matplotlib).</w:t>
       </w:r>
     </w:p>
-    <w:bookmarkEnd w:id="47"/>
-    <w:bookmarkStart w:id="48" w:name="author-contributions"/>
+    <w:bookmarkEnd w:id="48"/>
+    <w:bookmarkStart w:id="49" w:name="author-contributions"/>
     <w:p>
       <w:pPr>
         <w:pStyle w:val="Heading1"/>
@@ -4194,8 +4211,8 @@
         <w:t xml:space="preserve">N.S.: Conceptualisation, data curation, model development, analysis, manuscript writing.</w:t>
       </w:r>
     </w:p>
-    <w:bookmarkEnd w:id="48"/>
-    <w:bookmarkStart w:id="49" w:name="competing-interests"/>
+    <w:bookmarkEnd w:id="49"/>
+    <w:bookmarkStart w:id="50" w:name="competing-interests"/>
     <w:p>
       <w:pPr>
         <w:pStyle w:val="Heading1"/>
@@ -4212,8 +4229,8 @@
         <w:t xml:space="preserve">The author declares no competing interests.</w:t>
       </w:r>
     </w:p>
-    <w:bookmarkEnd w:id="49"/>
-    <w:bookmarkStart w:id="50" w:name="funding"/>
+    <w:bookmarkEnd w:id="50"/>
+    <w:bookmarkStart w:id="51" w:name="funding"/>
     <w:p>
       <w:pPr>
         <w:pStyle w:val="Heading1"/>
@@ -4230,8 +4247,8 @@
         <w:t xml:space="preserve">No external funding was received for this study.</w:t>
       </w:r>
     </w:p>
-    <w:bookmarkEnd w:id="50"/>
-    <w:bookmarkStart w:id="51" w:name="acknowledgements"/>
+    <w:bookmarkEnd w:id="51"/>
+    <w:bookmarkStart w:id="52" w:name="acknowledgements"/>
     <w:p>
       <w:pPr>
         <w:pStyle w:val="Heading1"/>
@@ -4802,7 +4819,7 @@
         <w:t xml:space="preserve">. 2021;8:652926.</w:t>
       </w:r>
     </w:p>
-    <w:bookmarkEnd w:id="51"/>
+    <w:bookmarkEnd w:id="52"/>
     <w:sectPr/>
   </w:body>
 </w:document>

</xml_diff>